<commit_message>
Actualizar la documentacion con el correo de cuentas (spec 003a)
El ERS 1.4 marca RF-02 como implementado y deja RF-03, RNF-07 y RNF-08 en parcial. Historias de Usuario 1.1 (HU-03, HU-22, HU-25), Casos de Uso 1.1 (CU-05, CU-15) y Procesos 1.1 (P7 y su diagrama) describen el aviso al Administrador cuando el correo no sale. Los PDF se nombran con su version y se eliminan los anteriores sin version.
</commit_message>
<xml_diff>
--- a/Documentacion/Documentacion_ServIA_2026/Casos de Uso - ServIA.docx
+++ b/Documentacion/Documentacion_ServIA_2026/Casos de Uso - ServIA.docx
@@ -99,7 +99,7 @@
           <w:sz w:val="22"/>
           <w:szCs w:val="22"/>
         </w:rPr>
-        <w:t xml:space="preserve">setiembre 2026</w:t>
+        <w:t xml:space="preserve">octubre 2026</w:t>
       </w:r>
     </w:p>
     <w:p>
@@ -122,7 +122,7 @@
           <w:sz w:val="22"/>
           <w:szCs w:val="22"/>
         </w:rPr>
-        <w:t xml:space="preserve">1.0</w:t>
+        <w:t xml:space="preserve">1.1</w:t>
       </w:r>
     </w:p>
     <w:p>
@@ -5752,20 +5752,20 @@
                 <w:sz w:val="20"/>
                 <w:szCs w:val="20"/>
               </w:rPr>
-              <w:t xml:space="preserve">8. El sistema envía la contraseña temporal al correo del nuevo usuario (&lt;&lt;include&gt;&gt; Enviar credenciales por correo) y registra la creación en la bitácora (&lt;&lt;include&gt;&gt; Registrar evento en bitácora).</w:t>
-            </w:r>
-          </w:p>
-          <w:p>
-            <w:pPr>
-              <w:spacing w:after="80"/>
-            </w:pPr>
-            <w:r>
-              <w:rPr>
-                <w:rFonts w:ascii="Calibri" w:cs="Calibri" w:eastAsia="Calibri" w:hAnsi="Calibri"/>
-                <w:sz w:val="20"/>
-                <w:szCs w:val="20"/>
-              </w:rPr>
-              <w:t xml:space="preserve">9. El sistema muestra "Usuario creado exitosamente" y actualiza la tabla.</w:t>
+              <w:t>8. El sistema envía la contraseña temporal al correo del nuevo usuario (&lt;&lt;include&gt;&gt; Enviar credenciales por correo) y registra la creación en la bitácora, con el resultado de la notificación (&lt;&lt;include&gt;&gt; Registrar evento en bitácora).</w:t>
+            </w:r>
+          </w:p>
+          <w:p>
+            <w:pPr>
+              <w:spacing w:after="80"/>
+            </w:pPr>
+            <w:r>
+              <w:rPr>
+                <w:rFonts w:ascii="Calibri" w:cs="Calibri" w:eastAsia="Calibri" w:hAnsi="Calibri"/>
+                <w:sz w:val="20"/>
+                <w:szCs w:val="20"/>
+              </w:rPr>
+              <w:t>9. El sistema muestra "Usuario creado exitosamente" (o la advertencia de FE-02) y actualiza la tabla.</w:t>
             </w:r>
           </w:p>
           <w:p>
@@ -5844,7 +5844,7 @@
                 <w:sz w:val="20"/>
                 <w:szCs w:val="20"/>
               </w:rPr>
-              <w:t xml:space="preserve">• FA-02 Restablecer contraseña: el Administrador selecciona "Resetear Contraseña" sobre un usuario (&lt;&lt;extend&gt;&gt; Restablecer contraseña de un usuario); el sistema genera una nueva contraseña temporal de 8 caracteres, limpia el último acceso para forzar su cambio, la envía por correo al usuario, registra el restablecimiento en la bitácora y muestra "Contraseña reseteada exitosamente".</w:t>
+              <w:t>• FA-02 Restablecer contraseña: el Administrador selecciona "Resetear Contraseña" sobre un usuario (&lt;&lt;extend&gt;&gt; Restablecer contraseña de un usuario); el sistema genera una nueva contraseña temporal de 8 caracteres, la envía por correo al usuario y, solo si el servidor de correo acepta el mensaje, la guarda cifrada y limpia el último acceso para forzar su cambio; registra el restablecimiento en la bitácora, con el resultado de la notificación, y muestra "Contraseña reseteada exitosamente".</w:t>
             </w:r>
           </w:p>
           <w:p>
@@ -5883,7 +5883,7 @@
                 <w:sz w:val="20"/>
                 <w:szCs w:val="20"/>
               </w:rPr>
-              <w:t xml:space="preserve">• FE-02 Falla del envío de correo: en el paso 8 o en FA-02, si el correo no puede enviarse, la cuenta se crea o la contraseña se restablece igualmente, pero el sistema informa al Administrador que la notificación no fue entregada, para que pueda repetir el restablecimiento (FA-02) cuando el servicio de correo esté disponible.</w:t>
+              <w:t>• FE-02 Falla del envío de correo: en el paso 8, si el correo no puede enviarse (incluido que el servidor no responda en 15 segundos), la cuenta se crea igualmente y el sistema muestra al Administrador la advertencia "Usuario creado, pero no se pudo enviar el correo con la contraseña temporal a &lt;correo&gt;. Use 'Resetear Contraseña' cuando el servicio de correo esté disponible."; en FA-02, si el correo no puede enviarse, la contraseña no se modifica, el cuadro de confirmación sigue abierto y el sistema muestra "No se pudo enviar el correo a &lt;correo&gt;. La contraseña no fue modificada. Verifique el servicio de correo e inténtelo de nuevo." para que el Administrador reintente. En ambos casos el intento queda en la bitácora con su resultado.</w:t>
             </w:r>
           </w:p>
         </w:tc>
@@ -13154,7 +13154,7 @@
                 <w:sz w:val="20"/>
                 <w:szCs w:val="20"/>
               </w:rPr>
-              <w:t xml:space="preserve">• FA-01 Ver detalle de un evento: el Administrador selecciona un registro (&lt;&lt;extend&gt;&gt; Ver detalle de un evento) y el sistema muestra su "Información Adicional"; por ejemplo, para una búsqueda de similares, el modo, el texto consultado, el umbral y el total de resultados; para una carga, el identificador del documento y su número de fragmentos; para una edición de usuario, los campos modificados.</w:t>
+              <w:t>• FA-01 Ver detalle de un evento: el Administrador selecciona un registro (&lt;&lt;extend&gt;&gt; Ver detalle de un evento) y el sistema muestra su "Información Adicional"; por ejemplo, para una búsqueda de similares, el modo, el texto consultado, el umbral y el total de resultados; para una carga, el identificador del documento y su número de fragmentos; para una edición de usuario, los campos modificados; para la creación de una cuenta o el restablecimiento de una contraseña, el resultado de la notificación por correo.</w:t>
             </w:r>
           </w:p>
           <w:p>

</xml_diff>

<commit_message>
Actualizar la documentacion con la recuperacion de contrasena (spec 003b)
El ERS 1.5, Historias de Usuario 1.2 (HU-26 nueva), Casos de Uso 1.2 (CU-04, CU-15) y Procesos 1.2 (P6 y su diagrama) describen la recuperacion por codigo: respuesta igual exista o no la cuenta, limites de solicitudes e intentos, servicio no disponible si falla el almacen temporal y registro de cada paso en la bitacora. Se agregan los PDF de cada version.
</commit_message>
<xml_diff>
--- a/Documentacion/Documentacion_ServIA_2026/Casos de Uso - ServIA.docx
+++ b/Documentacion/Documentacion_ServIA_2026/Casos de Uso - ServIA.docx
@@ -122,7 +122,7 @@
           <w:sz w:val="22"/>
           <w:szCs w:val="22"/>
         </w:rPr>
-        <w:t xml:space="preserve">1.1</w:t>
+        <w:t xml:space="preserve">1.2</w:t>
       </w:r>
     </w:p>
     <w:p>
@@ -4825,7 +4825,7 @@
                 <w:sz w:val="20"/>
                 <w:szCs w:val="20"/>
               </w:rPr>
-              <w:t xml:space="preserve">El usuario posee una cuenta registrada con un correo válido. Existe una cuenta de correo configurada en el entorno para el envío de notificaciones.</w:t>
+              <w:t xml:space="preserve">Para recibir el código, el usuario posee una cuenta Activa registrada con un correo válido; la pantalla y el aviso son los mismos tenga o no cuenta. Existe una cuenta de correo configurada en el entorno para el envío de notificaciones.</w:t>
             </w:r>
           </w:p>
         </w:tc>
@@ -4917,33 +4917,33 @@
                 <w:sz w:val="20"/>
                 <w:szCs w:val="20"/>
               </w:rPr>
-              <w:t xml:space="preserve">4. El sistema genera un código numérico de 6 dígitos, válido por 15 minutos, y lo envía al correo del usuario (&lt;&lt;include&gt;&gt; Enviar código de verificación).</w:t>
-            </w:r>
-          </w:p>
-          <w:p>
-            <w:pPr>
-              <w:spacing w:after="80"/>
-            </w:pPr>
-            <w:r>
-              <w:rPr>
-                <w:rFonts w:ascii="Calibri" w:cs="Calibri" w:eastAsia="Calibri" w:hAnsi="Calibri"/>
-                <w:sz w:val="20"/>
-                <w:szCs w:val="20"/>
-              </w:rPr>
-              <w:t xml:space="preserve">5. El sistema registra la solicitud de recuperación en la bitácora (&lt;&lt;include&gt;&gt; Registrar evento en bitácora) y muestra el mensaje "Si el correo existe en nuestro sistema, recibirás un email con las instrucciones", sin revelar si la cuenta existe.</w:t>
-            </w:r>
-          </w:p>
-          <w:p>
-            <w:pPr>
-              <w:spacing w:after="80"/>
-            </w:pPr>
-            <w:r>
-              <w:rPr>
-                <w:rFonts w:ascii="Calibri" w:cs="Calibri" w:eastAsia="Calibri" w:hAnsi="Calibri"/>
-                <w:sz w:val="20"/>
-                <w:szCs w:val="20"/>
-              </w:rPr>
-              <w:t xml:space="preserve">6. El sistema muestra el segundo paso; el usuario ingresa el código recibido.</w:t>
+              <w:t xml:space="preserve">4. El sistema genera un código numérico de 6 dígitos, válido por 15 minutos, y lo envía al correo de la cuenta cuando esta existe y está Activa (&lt;&lt;include&gt;&gt; Enviar código de verificación).</w:t>
+            </w:r>
+          </w:p>
+          <w:p>
+            <w:pPr>
+              <w:spacing w:after="80"/>
+            </w:pPr>
+            <w:r>
+              <w:rPr>
+                <w:rFonts w:ascii="Calibri" w:cs="Calibri" w:eastAsia="Calibri" w:hAnsi="Calibri"/>
+                <w:sz w:val="20"/>
+                <w:szCs w:val="20"/>
+              </w:rPr>
+              <w:t xml:space="preserve">5. El sistema responde siempre con el mensaje "Si el correo existe en nuestro sistema, recibirás un email con las instrucciones", sin revelar si la cuenta existe, y registra la solicitud con su resultado en la bitácora (&lt;&lt;include&gt;&gt; Registrar evento en bitácora).</w:t>
+            </w:r>
+          </w:p>
+          <w:p>
+            <w:pPr>
+              <w:spacing w:after="80"/>
+            </w:pPr>
+            <w:r>
+              <w:rPr>
+                <w:rFonts w:ascii="Calibri" w:cs="Calibri" w:eastAsia="Calibri" w:hAnsi="Calibri"/>
+                <w:sz w:val="20"/>
+                <w:szCs w:val="20"/>
+              </w:rPr>
+              <w:t xml:space="preserve">6. El sistema muestra el segundo paso; el usuario ingresa el código del correo de recuperación.</w:t>
             </w:r>
           </w:p>
           <w:p>
@@ -5061,7 +5061,7 @@
                 <w:sz w:val="20"/>
                 <w:szCs w:val="20"/>
               </w:rPr>
-              <w:t xml:space="preserve">• FE-01 Código incorrecto: en el paso 7, el sistema muestra "Código de verificación incorrecto" y registra el intento fallido en la bitácora.</w:t>
+              <w:t xml:space="preserve">• FE-01 Código incorrecto: en el paso 7, el sistema muestra "Código de verificación incorrecto" y registra el intento fallido en la bitácora. Cada código admite 5 intentos: al quinto intento fallido el código se invalida y el sistema muestra un panel con el mensaje "Superaste el número de intentos permitidos. Solicita un nuevo código de recuperación. Si lo pediste hace menos de un minuto, espera un momento antes de volver a pedirlo." y el botón "Solicitar nuevo código".</w:t>
             </w:r>
           </w:p>
           <w:p>
@@ -5113,7 +5113,33 @@
                 <w:sz w:val="20"/>
                 <w:szCs w:val="20"/>
               </w:rPr>
-              <w:t xml:space="preserve">• FE-05 Falla del envío de correo: en el paso 4, si el envío falla (por ejemplo, porque el entorno no tiene una cuenta de correo configurada), el sistema muestra "Error enviando email de recuperación" y el proceso no puede continuar; el usuario debe solicitar a un Administrador el restablecimiento de su contraseña (CU-05).</w:t>
+              <w:t xml:space="preserve">• FE-05 Falla del envío de correo: en el paso 4, si el envío falla (por ejemplo, porque el entorno no tiene una cuenta de correo configurada), el sistema no se lo informa a la persona (responde igual que en el paso 5) y lo registra en la bitácora como "envío fallido"; la persona puede pedir otro código pasado un minuto o solicitar a un Administrador que restablezca su contraseña (CU-05).</w:t>
+            </w:r>
+          </w:p>
+          <w:p>
+            <w:pPr>
+              <w:spacing w:after="80"/>
+            </w:pPr>
+            <w:r>
+              <w:rPr>
+                <w:rFonts w:ascii="Calibri" w:cs="Calibri" w:eastAsia="Calibri" w:hAnsi="Calibri"/>
+                <w:sz w:val="20"/>
+                <w:szCs w:val="20"/>
+              </w:rPr>
+              <w:t xml:space="preserve">• FE-06 Límite de solicitudes: en el paso 4, si el correo ya pidió un código hace menos de un minuto o ya hizo 5 solicitudes en la última hora, el sistema responde igual que en el paso 5, no envía ningún correo y lo registra en la bitácora como "límite alcanzado"; la persona puede intentarlo más tarde o solicitar a un Administrador que restablezca su contraseña (CU-05).</w:t>
+            </w:r>
+          </w:p>
+          <w:p>
+            <w:pPr>
+              <w:spacing w:after="80"/>
+            </w:pPr>
+            <w:r>
+              <w:rPr>
+                <w:rFonts w:ascii="Calibri" w:cs="Calibri" w:eastAsia="Calibri" w:hAnsi="Calibri"/>
+                <w:sz w:val="20"/>
+                <w:szCs w:val="20"/>
+              </w:rPr>
+              <w:t xml:space="preserve">• FE-07 Servicio no disponible: en cualquiera de los tres pasos, si el sistema no puede llevar el proceso en ese momento, muestra como aviso "El servicio de recuperación de contraseña no está disponible por el momento. Inténtalo de nuevo más tarde.", lo registra en la bitácora como "servicio no disponible" y permite reintentar.</w:t>
             </w:r>
           </w:p>
         </w:tc>
@@ -5169,7 +5195,7 @@
                 <w:sz w:val="20"/>
                 <w:szCs w:val="20"/>
               </w:rPr>
-              <w:t xml:space="preserve">La contraseña del usuario queda actualizada y cifrada en la base de datos, y cada paso del proceso queda registrado en la bitácora.</w:t>
+              <w:t xml:space="preserve">La contraseña del usuario queda actualizada y cifrada en la base de datos, y cada paso del proceso queda registrado en la bitácora con su resultado.</w:t>
             </w:r>
           </w:p>
         </w:tc>
@@ -13154,7 +13180,7 @@
                 <w:sz w:val="20"/>
                 <w:szCs w:val="20"/>
               </w:rPr>
-              <w:t>• FA-01 Ver detalle de un evento: el Administrador selecciona un registro (&lt;&lt;extend&gt;&gt; Ver detalle de un evento) y el sistema muestra su "Información Adicional"; por ejemplo, para una búsqueda de similares, el modo, el texto consultado, el umbral y el total de resultados; para una carga, el identificador del documento y su número de fragmentos; para una edición de usuario, los campos modificados; para la creación de una cuenta o el restablecimiento de una contraseña, el resultado de la notificación por correo.</w:t>
+              <w:t xml:space="preserve">• FA-01 Ver detalle de un evento: el Administrador selecciona un registro (&lt;&lt;extend&gt;&gt; Ver detalle de un evento) y el sistema muestra su "Información Adicional"; por ejemplo, para una búsqueda de similares, el modo, el texto consultado, el umbral y el total de resultados; para una carga, el identificador del documento y su número de fragmentos; para una edición de usuario, los campos modificados; para la creación de una cuenta o el restablecimiento de una contraseña, el resultado de la notificación por correo; para la recuperación de contraseña, el paso y su resultado.</w:t>
             </w:r>
           </w:p>
           <w:p>
@@ -14076,7 +14102,7 @@
           <w:sz w:val="22"/>
           <w:szCs w:val="22"/>
         </w:rPr>
-        <w:t xml:space="preserve">El envío de notificaciones por correo electrónico requiere una cuenta de correo configurada en el entorno. Ningún envío fallido pasa inadvertido: en la recuperación de contraseña, el sistema informa el error al usuario; en la creación de cuentas y el restablecimiento de contraseñas, informa al Administrador que la notificación no fue entregada.</w:t>
+        <w:t xml:space="preserve">El envío de notificaciones por correo electrónico requiere una cuenta de correo configurada en el entorno. Ningún envío fallido pasa inadvertido: en la recuperación de contraseña, el fallo queda registrado en la bitácora y no se informa a la persona, para no revelar qué correos están registrados; en la creación de cuentas y el restablecimiento de contraseñas, se informa al Administrador que la notificación no fue entregada.</w:t>
       </w:r>
     </w:p>
     <w:p>

</xml_diff>

<commit_message>
Actualizar la documentacion con la red de seguridad del backend (spec 004)
ERS V1.7 y Casos de Uso V1.4, con sus PDF. Pendiente del visto bueno del tutor el aislamiento de notebooks (RF-11, RF-12, RF-17, RF-20 y una frase de RNF-07).
</commit_message>
<xml_diff>
--- a/Documentacion/Documentacion_ServIA_2026/Casos de Uso - ServIA.docx
+++ b/Documentacion/Documentacion_ServIA_2026/Casos de Uso - ServIA.docx
@@ -122,7 +122,7 @@
           <w:sz w:val="22"/>
           <w:szCs w:val="22"/>
         </w:rPr>
-        <w:t xml:space="preserve">1.3</w:t>
+        <w:t xml:space="preserve">1.4</w:t>
       </w:r>
     </w:p>
     <w:p>
@@ -3546,7 +3546,7 @@
                 <w:sz w:val="20"/>
                 <w:szCs w:val="20"/>
               </w:rPr>
-              <w:t xml:space="preserve">5. El sistema elimina la sesión del navegador, de modo que el token deja de enviarse al servidor.</w:t>
+              <w:t xml:space="preserve">5. El sistema elimina la sesión del navegador y el servidor deja de aceptar ese token en cualquier solicitud posterior, incluida la renovación.</w:t>
             </w:r>
           </w:p>
           <w:p>
@@ -3694,7 +3694,7 @@
                 <w:sz w:val="20"/>
                 <w:szCs w:val="20"/>
               </w:rPr>
-              <w:t xml:space="preserve">La sesión del usuario queda cerrada en el navegador, el cierre queda registrado en la bitácora y las páginas protegidas dejan de estar accesibles hasta un nuevo inicio de sesión.</w:t>
+              <w:t xml:space="preserve">La sesión queda cerrada: el token ya no es válido aunque no haya vencido; el cierre queda registrado en la bitácora y las páginas protegidas dejan de estar accesibles hasta un nuevo inicio de sesión.</w:t>
             </w:r>
           </w:p>
         </w:tc>
@@ -7305,7 +7305,7 @@
                 <w:sz w:val="20"/>
                 <w:szCs w:val="20"/>
               </w:rPr>
-              <w:t xml:space="preserve">7. El sistema asocia cada archivo al tema indicado, creándolo si todavía no existe (&lt;&lt;include&gt;&gt; Asociar archivo a un tema), almacena el archivo, lo encola para su procesamiento y muestra "Subida iniciada: los archivos se están procesando en segundo plano".</w:t>
+              <w:t xml:space="preserve">7. El sistema asocia cada archivo al tema indicado, creándolo si todavía no existe (&lt;&lt;include&gt;&gt; Asociar archivo a un tema), almacena cada archivo aceptado y lo encola para su procesamiento. Tras la respuesta del servidor, muestra junto al tema la confirmación ("1 archivo enviado a procesamiento" o "&lt;n&gt; archivos enviados a procesamiento") y el motivo de cada archivo rechazado. Los rechazados no pasan a procesamiento. Si no se aceptó ninguno, muestra "No se aceptó ningún archivo. Revise el motivo de cada uno."</w:t>
             </w:r>
           </w:p>
           <w:p>
@@ -7488,7 +7488,7 @@
                 <w:sz w:val="20"/>
                 <w:szCs w:val="20"/>
               </w:rPr>
-              <w:t xml:space="preserve">• FE-03 Error de procesamiento: en el paso 9, si el procesamiento de un archivo falla, el documento queda en estado Error con el mensaje "No se pudo procesar el archivo. Por favor, intente nuevamente.", sin detener el procesamiento de los demás archivos.</w:t>
+              <w:t xml:space="preserve">• FE-03 Error de procesamiento: en el paso 9, si el procesamiento de un archivo falla, el documento queda en estado Error. El progreso muestra "No se pudo procesar el archivo. Por favor, intente nuevamente." junto con su causa (formato o tamaño no permitido, no se pudo extraer el texto, servicio de procesamiento no disponible, no se pudo guardar para la búsqueda o error interno), sin detalles técnicos y sin detener el procesamiento de los demás archivos.</w:t>
             </w:r>
           </w:p>
           <w:p>
@@ -13193,7 +13193,7 @@
                 <w:sz w:val="20"/>
                 <w:szCs w:val="20"/>
               </w:rPr>
-              <w:t xml:space="preserve">• FA-01 Ver detalle de un evento: el Administrador selecciona un registro (&lt;&lt;extend&gt;&gt; Ver detalle de un evento) y el sistema muestra su "Información Adicional"; por ejemplo, para una búsqueda de similares, el modo, el texto consultado, el umbral y el total de resultados; para una carga, el identificador del documento y su número de fragmentos; para una edición de usuario, los campos modificados; para la creación de una cuenta o el restablecimiento de una contraseña, el resultado de la notificación por correo; para la recuperación de contraseña, el paso y su resultado.</w:t>
+              <w:t xml:space="preserve">• FA-01 Ver detalle de un evento: el Administrador selecciona un registro (&lt;&lt;extend&gt;&gt; Ver detalle de un evento) y el sistema muestra su "Información Adicional"; por ejemplo, para una búsqueda de similares, el modo, el texto consultado, el umbral y el total de resultados; para una carga, el tipo de registro con sus datos (tema, fecha y hora, archivo, documento y fragmentos, archivos aceptados y rechazados o la causa del error); para un archivo rechazado, solo la fecha y hora y el motivo; para una edición de usuario, los campos modificados; para la creación de una cuenta o el restablecimiento de una contraseña, el resultado de la notificación por correo; para la recuperación de contraseña, el paso y su resultado.</w:t>
             </w:r>
           </w:p>
           <w:p>

</xml_diff>

<commit_message>
Actualizar la documentacion con las specs 004b y 005b
Aplicar el lote T10 de la 004b (aislamiento de notebooks) y los Estado
actual de la 005b (RA-02, RF-05, RF-07, RF-19, RF-22 y RNF-04, y la cita
verificada). ERS V1.7 a V1.8, Casos de Uso V1.4 a V1.5 y Modelo
Relacional 1.0 a 1.1, con sus PDF exportados.
</commit_message>
<xml_diff>
--- a/Documentacion/Documentacion_ServIA_2026/Casos de Uso - ServIA.docx
+++ b/Documentacion/Documentacion_ServIA_2026/Casos de Uso - ServIA.docx
@@ -122,7 +122,7 @@
           <w:sz w:val="22"/>
           <w:szCs w:val="22"/>
         </w:rPr>
-        <w:t xml:space="preserve">1.4</w:t>
+        <w:t xml:space="preserve">1.5</w:t>
       </w:r>
     </w:p>
     <w:p>
@@ -1984,7 +1984,7 @@
                 <w:sz w:val="20"/>
                 <w:szCs w:val="20"/>
               </w:rPr>
-              <w:t xml:space="preserve">RF-19</w:t>
+              <w:t xml:space="preserve">RF-19, RF-21</w:t>
             </w:r>
           </w:p>
         </w:tc>
@@ -8793,7 +8793,7 @@
                 <w:sz w:val="20"/>
                 <w:szCs w:val="20"/>
               </w:rPr>
-              <w:t xml:space="preserve">5. El sistema muestra el avance de la consulta ("Procesando consulta", "Analizando documentos", "Generando respuesta") y recupera los fragmentos más relevantes de la base de datos vectorial dentro del alcance definido (&lt;&lt;include&gt;&gt; Recuperar fragmentos relevantes). Si la pregunta menciona de forma exacta el identificador de un tema, combina un filtro exacto por ese tema con la búsqueda semántica; si ese filtro no produce resultados, repite la búsqueda sin él en vez de responder vacío.</w:t>
+              <w:t xml:space="preserve">5. El sistema muestra el avance de la consulta ("Procesando consulta", "Analizando documentos", "Generando respuesta") y recupera los fragmentos más relevantes de la base de datos vectorial dentro del alcance definido, sin documentos de los notebooks de otros usuarios (&lt;&lt;include&gt;&gt; Recuperar fragmentos relevantes). Si la pregunta menciona de forma exacta el identificador de un tema, combina un filtro exacto por ese tema con la búsqueda semántica; si ese filtro no produce resultados, repite la búsqueda sin él en vez de responder vacío.</w:t>
             </w:r>
           </w:p>
           <w:p>
@@ -8898,7 +8898,7 @@
                 <w:sz w:val="20"/>
                 <w:szCs w:val="20"/>
               </w:rPr>
-              <w:t xml:space="preserve">• FA-01 Historial de conversaciones: el usuario pulsa "Historial" (&lt;&lt;extend&gt;&gt; Consultar historial de conversaciones); el sistema lista las conversaciones guardadas, y el usuario puede abrir una para continuarla o eliminarla con "Eliminar conversación", que exige un segundo clic de confirmación. "Nueva conversación" inicia una conversación vacía.</w:t>
+              <w:t xml:space="preserve">• FA-01 Historial de conversaciones: el usuario pulsa "Historial" (&lt;&lt;extend&gt;&gt; Consultar historial de conversaciones); el sistema lista las conversaciones guardadas, y el usuario puede abrir una para continuarla o eliminarla con "Eliminar conversación", que exige un segundo clic de confirmación. "Nueva conversación" inicia una conversación vacía. Una conversación de otro usuario no puede abrirse, restaurarse ni eliminarse: el sistema responde como si no existiera.</w:t>
             </w:r>
           </w:p>
           <w:p>
@@ -8950,7 +8950,7 @@
                 <w:sz w:val="20"/>
                 <w:szCs w:val="20"/>
               </w:rPr>
-              <w:t xml:space="preserve">• FA-05 Consulta dentro de un notebook: en NotebookServIA (CU-11), el alcance queda fijado al notebook abierto; el campo de texto indica "Preguntale algo a &lt;nombre del notebook&gt;", las respuestas se basan solo en los documentos de ese notebook y la conversación se conserva de forma independiente por cada notebook.</w:t>
+              <w:t xml:space="preserve">• FA-05 Consulta dentro de un notebook: en NotebookServIA (CU-11), el alcance queda fijado al notebook abierto; el campo de texto indica "Preguntale algo a &lt;nombre del notebook&gt;", las respuestas se basan solo en los documentos de ese notebook y la conversación se conserva de forma independiente por cada notebook. Si el notebook no pertenece al usuario, no existe o su identificador no es válido, el sistema rechaza la consulta con la misma respuesta en todos los casos, sin consultar al motor de lenguaje ni guardar la conversación, y registra el intento en la bitácora.</w:t>
             </w:r>
           </w:p>
           <w:p>
@@ -11156,7 +11156,7 @@
           <w:sz w:val="22"/>
           <w:szCs w:val="22"/>
         </w:rPr>
-        <w:t xml:space="preserve">Requerimientos funcionales cubiertos: RF-19</w:t>
+        <w:t xml:space="preserve">Requerimientos funcionales cubiertos: RF-19, RF-21</w:t>
       </w:r>
     </w:p>
     <w:p>
@@ -11665,7 +11665,7 @@
                 <w:sz w:val="20"/>
                 <w:szCs w:val="20"/>
               </w:rPr>
-              <w:t xml:space="preserve">5. El sistema verifica que el documento pertenezca al notebook del usuario (&lt;&lt;include&gt;&gt; Verificar pertenencia del documento).</w:t>
+              <w:t xml:space="preserve">5. El sistema verifica que el documento pertenezca al notebook del usuario (&lt;&lt;include&gt;&gt; Verificar pertenencia del documento); si no, FE-02.</w:t>
             </w:r>
           </w:p>
           <w:p>
@@ -11717,7 +11717,7 @@
                 <w:sz w:val="20"/>
                 <w:szCs w:val="20"/>
               </w:rPr>
-              <w:t xml:space="preserve">9. El sistema quita el documento de la lista del notebook.</w:t>
+              <w:t xml:space="preserve">9. El sistema quita el documento de la lista del notebook y registra la acción en la bitácora (&lt;&lt;include&gt;&gt; Registrar evento en bitácora).</w:t>
             </w:r>
           </w:p>
           <w:p>
@@ -11796,7 +11796,20 @@
                 <w:sz w:val="20"/>
                 <w:szCs w:val="20"/>
               </w:rPr>
-              <w:t xml:space="preserve">• FE-01 Error al eliminar: si alguna de las eliminaciones falla, el documento permanece en la lista del notebook.</w:t>
+              <w:t xml:space="preserve">• FE-01 Error al eliminar: si alguna de las eliminaciones falla, el documento permanece en la lista, el sistema muestra "No se pudo quitar el documento. Intente de nuevo." y registra el fallo; un nuevo intento completa lo que faltó. Un archivo o unos fragmentos que ya no existen cuentan como eliminados.</w:t>
+            </w:r>
+          </w:p>
+          <w:p>
+            <w:pPr>
+              <w:spacing w:after="80"/>
+            </w:pPr>
+            <w:r>
+              <w:rPr>
+                <w:rFonts w:ascii="Calibri" w:cs="Calibri" w:eastAsia="Calibri" w:hAnsi="Calibri"/>
+                <w:sz w:val="20"/>
+                <w:szCs w:val="20"/>
+              </w:rPr>
+              <w:t xml:space="preserve">• FE-02 Documento o notebook no disponible: si el documento o el notebook son de otro usuario o no existen, el sistema responde como si no existieran, no elimina nada y registra el intento solo con su motivo.</w:t>
             </w:r>
           </w:p>
         </w:tc>

</xml_diff>